<commit_message>
Checked code and adjusted as needed
</commit_message>
<xml_diff>
--- a/Manuscript/EcoLetts_Submission/CoverLetter_EcoLetters.docx
+++ b/Manuscript/EcoLetts_Submission/CoverLetter_EcoLetters.docx
@@ -58,7 +58,19 @@
         <w:rPr>
           <w:rFonts w:ascii="Times New Roman" w:hAnsi="Times New Roman" w:cs="Times New Roman"/>
         </w:rPr>
-        <w:t>Habitat coupling is a central concept in food web ecology, yet it is often inferred from the movements and resource use of large-bodied consumers. In this manuscript, we show that small-bodied fishes can also act as important habitat couplers, linking adjacent freshwater lake and creek habitats through both resource assimilation and movement behaviour. Using a multi-method field approach including stable isotope analysis, acoustic telemetry, and seasonal biomass flux estimates, we demonstrate that these fishes integrate carbon from both habitats, move frequently across the lake–creek boundary, and contribute to seasonal exchange of biomass between habitats.</w:t>
+        <w:t xml:space="preserve">Habitat coupling is a central concept in food web ecology, yet it is often inferred from the movements and resource use of large-bodied consumers. In this manuscript, we show that small-bodied fishes can also act as important habitat couplers, linking adjacent freshwater lake and creek habitats through both resource assimilation and movement behaviour. Using a multi-method field approach including stable isotope analysis, acoustic telemetry, and seasonal </w:t>
+      </w:r>
+      <w:r>
+        <w:rPr>
+          <w:rFonts w:ascii="Times New Roman" w:hAnsi="Times New Roman" w:cs="Times New Roman"/>
+        </w:rPr>
+        <w:t>netting surveys</w:t>
+      </w:r>
+      <w:r>
+        <w:rPr>
+          <w:rFonts w:ascii="Times New Roman" w:hAnsi="Times New Roman" w:cs="Times New Roman"/>
+        </w:rPr>
+        <w:t>, we demonstrate that these fishes integrate carbon from both habitats, move frequently across the lake–creek boundary, and contribute to seasonal exchange of biomass between habitats.</w:t>
       </w:r>
     </w:p>
     <w:p>
@@ -146,7 +158,7 @@
           <w:rFonts w:ascii="Times New Roman" w:hAnsi="Times New Roman" w:cs="Times New Roman"/>
         </w:rPr>
         <w:br/>
-        <w:t>Dr. Charlotte A. Ward</w:t>
+        <w:t>Charlotte Ward</w:t>
       </w:r>
       <w:r>
         <w:rPr>
@@ -1026,6 +1038,7 @@
   <w:style w:type="character" w:default="1" w:styleId="DefaultParagraphFont">
     <w:name w:val="Default Paragraph Font"/>
     <w:uiPriority w:val="1"/>
+    <w:semiHidden/>
     <w:unhideWhenUsed/>
   </w:style>
   <w:style w:type="table" w:default="1" w:styleId="TableNormal">

</xml_diff>